<commit_message>
docs: one bullet per source in the Word copy's Sources section
Co-Authored-By: Claude Opus 5.5 <noreply@anthropic.com>
</commit_message>
<xml_diff>
--- a/docs/LLM_TEXT_SIGNALS_RESEARCH.docx
+++ b/docs/LLM_TEXT_SIGNALS_RESEARCH.docx
@@ -14657,102 +14657,425 @@
         </w:rPr>
         <w:t xml:space="preserve">Papers, return prediction and look-ahead</w:t>
       </w:r>
-      <w:r>
-        <w:t xml:space="preserve"> </w:t>
-      </w:r>
-      <w:r>
-        <w:t xml:space="preserve">- Lopez-Lira &amp; Tang, arXiv 2304.07619 v6 — https://arxiv.org/pdf/2304.07619v6</w:t>
-      </w:r>
-      <w:r>
-        <w:t xml:space="preserve"> </w:t>
-      </w:r>
-      <w:r>
-        <w:t xml:space="preserve">- Chen, Kelly &amp; Xiu, SSRN 4416687 (not opened) — slides https://jacobslevycenter.wharton.upenn.edu/wp-content/uploads/2024/09/Kelly-WhartonJL.pdf ; discussion https://jacobslevycenter.wharton.upenn.edu/wp-content/uploads/2024/09/ExpectedReturnAndLLM_Discussion_SophiaZhengziLi_NoPause.pdf ; abstract https://acem.sjtu.edu.cn/academic/82735.html ; Xiu CV https://dachxiu.chicagobooth.edu/download/CV.pdf</w:t>
-      </w:r>
-      <w:r>
-        <w:t xml:space="preserve"> </w:t>
-      </w:r>
-      <w:r>
-        <w:t xml:space="preserve">- He, Lv, Manela &amp; Wu, arXiv 2502.21206 — https://arxiv.org/html/2502.21206v3 ; weights https://huggingface.co/manelalab ; code https://github.com/LinyingLyu/ChronoGPT</w:t>
-      </w:r>
-      <w:r>
-        <w:t xml:space="preserve"> </w:t>
-      </w:r>
-      <w:r>
-        <w:t xml:space="preserve">- Glasserman &amp; Lin, arXiv 2309.17322 — https://arxiv.org/html/2309.17322 ; poster (Wayback) https://web.archive.org/web/2024id_/https://datascience.columbia.edu/wp-content/uploads/2024/01/P021_FB_PosterSession_Fall2023.pdf</w:t>
-      </w:r>
-      <w:r>
-        <w:t xml:space="preserve"> </w:t>
-      </w:r>
-      <w:r>
-        <w:t xml:space="preserve">- Sarkar &amp; Vafa — https://conference.nber.org/conf_papers/f205530/f205530.pdf</w:t>
-      </w:r>
-      <w:r>
-        <w:t xml:space="preserve"> </w:t>
-      </w:r>
-      <w:r>
-        <w:t xml:space="preserve">- Lopez-Lira, Tang &amp; Zhu, arXiv 2504.14765 — https://arxiv.org/abs/2504.14765</w:t>
-      </w:r>
-      <w:r>
-        <w:t xml:space="preserve"> </w:t>
-      </w:r>
-      <w:r>
-        <w:t xml:space="preserve">- Engelberg et al., Entity Neutering (SSRN 5182756) — https://negocios.uchile.cl/events/seminario-academico-entity-neutering/</w:t>
-      </w:r>
-      <w:r>
-        <w:t xml:space="preserve"> </w:t>
-      </w:r>
-      <w:r>
-        <w:t xml:space="preserve">- Gao, Jiang &amp; Yan, arXiv 2512.23847 — https://arxiv.org/abs/2512.23847</w:t>
-      </w:r>
-      <w:r>
-        <w:t xml:space="preserve"> </w:t>
-      </w:r>
-      <w:r>
-        <w:t xml:space="preserve">- DatedGPT, arXiv 2603.11838 — https://arxiv.org/abs/2603.11838 ; Time Machine GPT, arXiv 2404.18543 — https://arxiv.org/abs/2404.18543 ; StoriesLM — https://huggingface.co/StoriesLM/StoriesLM-v1-1925</w:t>
-      </w:r>
-      <w:r>
-        <w:t xml:space="preserve"> </w:t>
-      </w:r>
-      <w:r>
-        <w:t xml:space="preserve">- Didisheim, Fraschini &amp; Somoza — https://faculty.essec.edu/research/16148-ais-predictable-memory-in-financial-analysis</w:t>
-      </w:r>
-      <w:r>
-        <w:t xml:space="preserve"> </w:t>
-      </w:r>
-      <w:r>
-        <w:t xml:space="preserve">- Levy, Caution Ahead — https://www.chicagobooth.edu/research/fama-miller/finance-research/working-papers/2025/caution-ahead</w:t>
-      </w:r>
-      <w:r>
-        <w:t xml:space="preserve"> </w:t>
-      </w:r>
-      <w:r>
-        <w:t xml:space="preserve">- FinLake-Bench, arXiv 2510.07920 — https://arxiv.org/abs/2510.07920 ; Look-Ahead-Bench, arXiv 2601.13770 — https://arxiv.org/abs/2601.13770</w:t>
-      </w:r>
-      <w:r>
-        <w:t xml:space="preserve"> </w:t>
-      </w:r>
-      <w:r>
-        <w:t xml:space="preserve">- Kirtac &amp; Germano, arXiv 2412.19245 — https://arxiv.org/pdf/2412.19245v1</w:t>
-      </w:r>
-      <w:r>
-        <w:t xml:space="preserve"> </w:t>
-      </w:r>
-      <w:r>
-        <w:t xml:space="preserve">- Anic, Barbon, Seiz &amp; Zarattini, arXiv 2510.26228 — https://arxiv.org/pdf/2510.26228v1</w:t>
-      </w:r>
-      <w:r>
-        <w:t xml:space="preserve"> </w:t>
-      </w:r>
-      <w:r>
-        <w:t xml:space="preserve">- Ke, Kelly &amp; Xiu, NBER w26186 — https://www.nber.org/system/files/working_papers/w26186/w26186.pdf</w:t>
-      </w:r>
-      <w:r>
-        <w:t xml:space="preserve"> </w:t>
-      </w:r>
-      <w:r>
-        <w:t xml:space="preserve">- Jha, Qian, Weber &amp; Yang, NBER w32161 — https://www.nber.org/system/files/working_papers/w32161/w32161.pdf</w:t>
-      </w:r>
+    </w:p>
+    <w:p>
+      <w:pPr>
+        <w:pStyle w:val="Compact"/>
+        <w:numPr>
+          <w:ilvl w:val="0"/>
+          <w:numId w:val="1001"/>
+        </w:numPr>
+      </w:pPr>
+      <w:r>
+        <w:t xml:space="preserve">Lopez-Lira &amp; Tang, arXiv 2304.07619 v6 — </w:t>
+      </w:r>
+      <w:hyperlink r:id="rId9">
+        <w:r>
+          <w:rPr>
+            <w:rStyle w:val="Hyperlink"/>
+          </w:rPr>
+          <w:t xml:space="preserve">https://arxiv.org/pdf/2304.07619v6</w:t>
+        </w:r>
+      </w:hyperlink>
+    </w:p>
+    <w:p>
+      <w:pPr>
+        <w:pStyle w:val="Compact"/>
+        <w:numPr>
+          <w:ilvl w:val="0"/>
+          <w:numId w:val="1001"/>
+        </w:numPr>
+      </w:pPr>
+      <w:r>
+        <w:t xml:space="preserve">Chen, Kelly &amp; Xiu, SSRN 4416687 (not opened) — slides </w:t>
+      </w:r>
+      <w:hyperlink r:id="rId22">
+        <w:r>
+          <w:rPr>
+            <w:rStyle w:val="Hyperlink"/>
+          </w:rPr>
+          <w:t xml:space="preserve">https://jacobslevycenter.wharton.upenn.edu/wp-content/uploads/2024/09/Kelly-WhartonJL.pdf</w:t>
+        </w:r>
+      </w:hyperlink>
+      <w:r>
+        <w:t xml:space="preserve"> ; discussion </w:t>
+      </w:r>
+      <w:hyperlink r:id="rId24">
+        <w:r>
+          <w:rPr>
+            <w:rStyle w:val="Hyperlink"/>
+          </w:rPr>
+          <w:t xml:space="preserve">https://jacobslevycenter.wharton.upenn.edu/wp-content/uploads/2024/09/ExpectedReturnAndLLM_Discussion_SophiaZhengziLi_NoPause.pdf</w:t>
+        </w:r>
+      </w:hyperlink>
+      <w:r>
+        <w:t xml:space="preserve"> ; abstract </w:t>
+      </w:r>
+      <w:hyperlink r:id="rId23">
+        <w:r>
+          <w:rPr>
+            <w:rStyle w:val="Hyperlink"/>
+          </w:rPr>
+          <w:t xml:space="preserve">https://acem.sjtu.edu.cn/academic/82735.html</w:t>
+        </w:r>
+      </w:hyperlink>
+      <w:r>
+        <w:t xml:space="preserve"> ; Xiu CV </w:t>
+      </w:r>
+      <w:hyperlink r:id="rId21">
+        <w:r>
+          <w:rPr>
+            <w:rStyle w:val="Hyperlink"/>
+          </w:rPr>
+          <w:t xml:space="preserve">https://dachxiu.chicagobooth.edu/download/CV.pdf</w:t>
+        </w:r>
+      </w:hyperlink>
+    </w:p>
+    <w:p>
+      <w:pPr>
+        <w:pStyle w:val="Compact"/>
+        <w:numPr>
+          <w:ilvl w:val="0"/>
+          <w:numId w:val="1001"/>
+        </w:numPr>
+      </w:pPr>
+      <w:r>
+        <w:t xml:space="preserve">He, Lv, Manela &amp; Wu, arXiv 2502.21206 — </w:t>
+      </w:r>
+      <w:hyperlink r:id="rId13">
+        <w:r>
+          <w:rPr>
+            <w:rStyle w:val="Hyperlink"/>
+          </w:rPr>
+          <w:t xml:space="preserve">https://arxiv.org/html/2502.21206v3</w:t>
+        </w:r>
+      </w:hyperlink>
+      <w:r>
+        <w:t xml:space="preserve"> ; weights </w:t>
+      </w:r>
+      <w:hyperlink r:id="rId26">
+        <w:r>
+          <w:rPr>
+            <w:rStyle w:val="Hyperlink"/>
+          </w:rPr>
+          <w:t xml:space="preserve">https://huggingface.co/manelalab</w:t>
+        </w:r>
+      </w:hyperlink>
+      <w:r>
+        <w:t xml:space="preserve"> ; code </w:t>
+      </w:r>
+      <w:hyperlink r:id="rId28">
+        <w:r>
+          <w:rPr>
+            <w:rStyle w:val="Hyperlink"/>
+          </w:rPr>
+          <w:t xml:space="preserve">https://github.com/LinyingLyu/ChronoGPT</w:t>
+        </w:r>
+      </w:hyperlink>
+    </w:p>
+    <w:p>
+      <w:pPr>
+        <w:pStyle w:val="Compact"/>
+        <w:numPr>
+          <w:ilvl w:val="0"/>
+          <w:numId w:val="1001"/>
+        </w:numPr>
+      </w:pPr>
+      <w:r>
+        <w:t xml:space="preserve">Glasserman &amp; Lin, arXiv 2309.17322 — </w:t>
+      </w:r>
+      <w:hyperlink r:id="rId31">
+        <w:r>
+          <w:rPr>
+            <w:rStyle w:val="Hyperlink"/>
+          </w:rPr>
+          <w:t xml:space="preserve">https://arxiv.org/html/2309.17322</w:t>
+        </w:r>
+      </w:hyperlink>
+      <w:r>
+        <w:t xml:space="preserve"> ; poster (Wayback) </w:t>
+      </w:r>
+      <w:hyperlink r:id="rId32">
+        <w:r>
+          <w:rPr>
+            <w:rStyle w:val="Hyperlink"/>
+          </w:rPr>
+          <w:t xml:space="preserve">https://web.archive.org/web/2024id_/https://datascience.columbia.edu/wp-content/uploads/2024/01/P021_FB_PosterSession_Fall2023.pdf</w:t>
+        </w:r>
+      </w:hyperlink>
+    </w:p>
+    <w:p>
+      <w:pPr>
+        <w:pStyle w:val="Compact"/>
+        <w:numPr>
+          <w:ilvl w:val="0"/>
+          <w:numId w:val="1001"/>
+        </w:numPr>
+      </w:pPr>
+      <w:r>
+        <w:t xml:space="preserve">Sarkar &amp; Vafa — </w:t>
+      </w:r>
+      <w:hyperlink r:id="rId10">
+        <w:r>
+          <w:rPr>
+            <w:rStyle w:val="Hyperlink"/>
+          </w:rPr>
+          <w:t xml:space="preserve">https://conference.nber.org/conf_papers/f205530/f205530.pdf</w:t>
+        </w:r>
+      </w:hyperlink>
+    </w:p>
+    <w:p>
+      <w:pPr>
+        <w:pStyle w:val="Compact"/>
+        <w:numPr>
+          <w:ilvl w:val="0"/>
+          <w:numId w:val="1001"/>
+        </w:numPr>
+      </w:pPr>
+      <w:r>
+        <w:t xml:space="preserve">Lopez-Lira, Tang &amp; Zhu, arXiv 2504.14765 — </w:t>
+      </w:r>
+      <w:hyperlink r:id="rId11">
+        <w:r>
+          <w:rPr>
+            <w:rStyle w:val="Hyperlink"/>
+          </w:rPr>
+          <w:t xml:space="preserve">https://arxiv.org/abs/2504.14765</w:t>
+        </w:r>
+      </w:hyperlink>
+    </w:p>
+    <w:p>
+      <w:pPr>
+        <w:pStyle w:val="Compact"/>
+        <w:numPr>
+          <w:ilvl w:val="0"/>
+          <w:numId w:val="1001"/>
+        </w:numPr>
+      </w:pPr>
+      <w:r>
+        <w:t xml:space="preserve">Engelberg et al., Entity Neutering (SSRN 5182756) — </w:t>
+      </w:r>
+      <w:hyperlink r:id="rId34">
+        <w:r>
+          <w:rPr>
+            <w:rStyle w:val="Hyperlink"/>
+          </w:rPr>
+          <w:t xml:space="preserve">https://negocios.uchile.cl/events/seminario-academico-entity-neutering/</w:t>
+        </w:r>
+      </w:hyperlink>
+    </w:p>
+    <w:p>
+      <w:pPr>
+        <w:pStyle w:val="Compact"/>
+        <w:numPr>
+          <w:ilvl w:val="0"/>
+          <w:numId w:val="1001"/>
+        </w:numPr>
+      </w:pPr>
+      <w:r>
+        <w:t xml:space="preserve">Gao, Jiang &amp; Yan, arXiv 2512.23847 — </w:t>
+      </w:r>
+      <w:hyperlink r:id="rId35">
+        <w:r>
+          <w:rPr>
+            <w:rStyle w:val="Hyperlink"/>
+          </w:rPr>
+          <w:t xml:space="preserve">https://arxiv.org/abs/2512.23847</w:t>
+        </w:r>
+      </w:hyperlink>
+    </w:p>
+    <w:p>
+      <w:pPr>
+        <w:pStyle w:val="Compact"/>
+        <w:numPr>
+          <w:ilvl w:val="0"/>
+          <w:numId w:val="1001"/>
+        </w:numPr>
+      </w:pPr>
+      <w:r>
+        <w:t xml:space="preserve">DatedGPT, arXiv 2603.11838 — </w:t>
+      </w:r>
+      <w:hyperlink r:id="rId36">
+        <w:r>
+          <w:rPr>
+            <w:rStyle w:val="Hyperlink"/>
+          </w:rPr>
+          <w:t xml:space="preserve">https://arxiv.org/abs/2603.11838</w:t>
+        </w:r>
+      </w:hyperlink>
+      <w:r>
+        <w:t xml:space="preserve"> ; Time Machine GPT, arXiv 2404.18543 — </w:t>
+      </w:r>
+      <w:hyperlink r:id="rId37">
+        <w:r>
+          <w:rPr>
+            <w:rStyle w:val="Hyperlink"/>
+          </w:rPr>
+          <w:t xml:space="preserve">https://arxiv.org/abs/2404.18543</w:t>
+        </w:r>
+      </w:hyperlink>
+      <w:r>
+        <w:t xml:space="preserve"> ; StoriesLM — </w:t>
+      </w:r>
+      <w:hyperlink r:id="rId38">
+        <w:r>
+          <w:rPr>
+            <w:rStyle w:val="Hyperlink"/>
+          </w:rPr>
+          <w:t xml:space="preserve">https://huggingface.co/StoriesLM/StoriesLM-v1-1925</w:t>
+        </w:r>
+      </w:hyperlink>
+    </w:p>
+    <w:p>
+      <w:pPr>
+        <w:pStyle w:val="Compact"/>
+        <w:numPr>
+          <w:ilvl w:val="0"/>
+          <w:numId w:val="1001"/>
+        </w:numPr>
+      </w:pPr>
+      <w:r>
+        <w:t xml:space="preserve">Didisheim, Fraschini &amp; Somoza — </w:t>
+      </w:r>
+      <w:hyperlink r:id="rId39">
+        <w:r>
+          <w:rPr>
+            <w:rStyle w:val="Hyperlink"/>
+          </w:rPr>
+          <w:t xml:space="preserve">https://faculty.essec.edu/research/16148-ais-predictable-memory-in-financial-analysis</w:t>
+        </w:r>
+      </w:hyperlink>
+    </w:p>
+    <w:p>
+      <w:pPr>
+        <w:pStyle w:val="Compact"/>
+        <w:numPr>
+          <w:ilvl w:val="0"/>
+          <w:numId w:val="1001"/>
+        </w:numPr>
+      </w:pPr>
+      <w:r>
+        <w:t xml:space="preserve">Levy, Caution Ahead — </w:t>
+      </w:r>
+      <w:hyperlink r:id="rId42">
+        <w:r>
+          <w:rPr>
+            <w:rStyle w:val="Hyperlink"/>
+          </w:rPr>
+          <w:t xml:space="preserve">https://www.chicagobooth.edu/research/fama-miller/finance-research/working-papers/2025/caution-ahead</w:t>
+        </w:r>
+      </w:hyperlink>
+    </w:p>
+    <w:p>
+      <w:pPr>
+        <w:pStyle w:val="Compact"/>
+        <w:numPr>
+          <w:ilvl w:val="0"/>
+          <w:numId w:val="1001"/>
+        </w:numPr>
+      </w:pPr>
+      <w:r>
+        <w:t xml:space="preserve">FinLake-Bench, arXiv 2510.07920 — </w:t>
+      </w:r>
+      <w:hyperlink r:id="rId40">
+        <w:r>
+          <w:rPr>
+            <w:rStyle w:val="Hyperlink"/>
+          </w:rPr>
+          <w:t xml:space="preserve">https://arxiv.org/abs/2510.07920</w:t>
+        </w:r>
+      </w:hyperlink>
+      <w:r>
+        <w:t xml:space="preserve"> ; Look-Ahead-Bench, arXiv 2601.13770 — </w:t>
+      </w:r>
+      <w:hyperlink r:id="rId41">
+        <w:r>
+          <w:rPr>
+            <w:rStyle w:val="Hyperlink"/>
+          </w:rPr>
+          <w:t xml:space="preserve">https://arxiv.org/abs/2601.13770</w:t>
+        </w:r>
+      </w:hyperlink>
+    </w:p>
+    <w:p>
+      <w:pPr>
+        <w:pStyle w:val="Compact"/>
+        <w:numPr>
+          <w:ilvl w:val="0"/>
+          <w:numId w:val="1001"/>
+        </w:numPr>
+      </w:pPr>
+      <w:r>
+        <w:t xml:space="preserve">Kirtac &amp; Germano, arXiv 2412.19245 — </w:t>
+      </w:r>
+      <w:hyperlink r:id="rId45">
+        <w:r>
+          <w:rPr>
+            <w:rStyle w:val="Hyperlink"/>
+          </w:rPr>
+          <w:t xml:space="preserve">https://arxiv.org/pdf/2412.19245v1</w:t>
+        </w:r>
+      </w:hyperlink>
+    </w:p>
+    <w:p>
+      <w:pPr>
+        <w:pStyle w:val="Compact"/>
+        <w:numPr>
+          <w:ilvl w:val="0"/>
+          <w:numId w:val="1001"/>
+        </w:numPr>
+      </w:pPr>
+      <w:r>
+        <w:t xml:space="preserve">Anic, Barbon, Seiz &amp; Zarattini, arXiv 2510.26228 — </w:t>
+      </w:r>
+      <w:hyperlink r:id="rId48">
+        <w:r>
+          <w:rPr>
+            <w:rStyle w:val="Hyperlink"/>
+          </w:rPr>
+          <w:t xml:space="preserve">https://arxiv.org/pdf/2510.26228v1</w:t>
+        </w:r>
+      </w:hyperlink>
+    </w:p>
+    <w:p>
+      <w:pPr>
+        <w:pStyle w:val="Compact"/>
+        <w:numPr>
+          <w:ilvl w:val="0"/>
+          <w:numId w:val="1001"/>
+        </w:numPr>
+      </w:pPr>
+      <w:r>
+        <w:t xml:space="preserve">Ke, Kelly &amp; Xiu, NBER w26186 — </w:t>
+      </w:r>
+      <w:hyperlink r:id="rId50">
+        <w:r>
+          <w:rPr>
+            <w:rStyle w:val="Hyperlink"/>
+          </w:rPr>
+          <w:t xml:space="preserve">https://www.nber.org/system/files/working_papers/w26186/w26186.pdf</w:t>
+        </w:r>
+      </w:hyperlink>
+    </w:p>
+    <w:p>
+      <w:pPr>
+        <w:pStyle w:val="Compact"/>
+        <w:numPr>
+          <w:ilvl w:val="0"/>
+          <w:numId w:val="1001"/>
+        </w:numPr>
+      </w:pPr>
+      <w:r>
+        <w:t xml:space="preserve">Jha, Qian, Weber &amp; Yang, NBER w32161 — </w:t>
+      </w:r>
+      <w:hyperlink r:id="rId14">
+        <w:r>
+          <w:rPr>
+            <w:rStyle w:val="Hyperlink"/>
+          </w:rPr>
+          <w:t xml:space="preserve">https://www.nber.org/system/files/working_papers/w32161/w32161.pdf</w:t>
+        </w:r>
+      </w:hyperlink>
     </w:p>
     <w:p>
       <w:pPr>
@@ -14765,72 +15088,270 @@
         </w:rPr>
         <w:t xml:space="preserve">Papers, exposure and themes</w:t>
       </w:r>
-      <w:r>
-        <w:t xml:space="preserve"> </w:t>
-      </w:r>
-      <w:r>
-        <w:t xml:space="preserve">- Hassan et al., NBER w24029 — https://www.nber.org/system/files/working_papers/w24029/w24029.pdf ; data https://www.firmlevelrisk.com/</w:t>
-      </w:r>
-      <w:r>
-        <w:t xml:space="preserve"> </w:t>
-      </w:r>
-      <w:r>
-        <w:t xml:space="preserve">- Sautner et al., ECGI WP 686/2020 — https://www.ecgi.global/sites/default/files/working_papers/documents/firmlevelclimatechangeexposure.pdf ; data https://api.osf.io/v2/nodes/fd6jq/</w:t>
-      </w:r>
-      <w:r>
-        <w:t xml:space="preserve"> </w:t>
-      </w:r>
-      <w:r>
-        <w:t xml:space="preserve">- Bybee, Kelly, Manela &amp; Xiu, NBER w29344 — https://www.nber.org/system/files/working_papers/w29344/w29344.pdf</w:t>
-      </w:r>
-      <w:r>
-        <w:t xml:space="preserve"> </w:t>
-      </w:r>
-      <w:r>
-        <w:t xml:space="preserve">- Kim, Muhn &amp; Nikolaev — https://arxiv.org/pdf/2310.17721v2 ; withdrawn https://arxiv.org/abs/2306.10224 , https://arxiv.org/abs/2407.17866</w:t>
-      </w:r>
-      <w:r>
-        <w:t xml:space="preserve"> </w:t>
-      </w:r>
-      <w:r>
-        <w:t xml:space="preserve">- Eisfeldt, Schubert &amp; Zhang, NBER w31222 — https://www.nber.org/papers/w31222</w:t>
-      </w:r>
-      <w:r>
-        <w:t xml:space="preserve"> </w:t>
-      </w:r>
-      <w:r>
-        <w:t xml:space="preserve">- THEME, arXiv 2508.16936 — https://arxiv.org/html/2508.16936v2</w:t>
-      </w:r>
-      <w:r>
-        <w:t xml:space="preserve"> </w:t>
-      </w:r>
-      <w:r>
-        <w:t xml:space="preserve">- Gandouet et al., arXiv 2403.02185 — https://arxiv.org/pdf/2403.02185</w:t>
-      </w:r>
-      <w:r>
-        <w:t xml:space="preserve"> </w:t>
-      </w:r>
-      <w:r>
-        <w:t xml:space="preserve">- From Text to Alpha, arXiv 2510.03195 — https://arxiv.org/html/2510.03195v5</w:t>
-      </w:r>
-      <w:r>
-        <w:t xml:space="preserve"> </w:t>
-      </w:r>
-      <w:r>
-        <w:t xml:space="preserve">- Agentic Retrieval of Topics, arXiv 2507.07906 — https://arxiv.org/html/2507.07906v1</w:t>
-      </w:r>
-      <w:r>
-        <w:t xml:space="preserve"> </w:t>
-      </w:r>
-      <w:r>
-        <w:t xml:space="preserve">- Candès et al., FAJ 2025 / SSRN 5336504 — https://rpc.cfainstitute.org/research/financial-analysts-journal/2025/thematic-investing-risk-based-perspective</w:t>
-      </w:r>
-      <w:r>
-        <w:t xml:space="preserve"> </w:t>
-      </w:r>
-      <w:r>
-        <w:t xml:space="preserve">- Ang, Azimbayev &amp; Kim, arXiv 2604.02279 — https://arxiv.org/abs/2604.02279</w:t>
-      </w:r>
+    </w:p>
+    <w:p>
+      <w:pPr>
+        <w:pStyle w:val="Compact"/>
+        <w:numPr>
+          <w:ilvl w:val="0"/>
+          <w:numId w:val="1001"/>
+        </w:numPr>
+      </w:pPr>
+      <w:r>
+        <w:t xml:space="preserve">Hassan et al., NBER w24029 — </w:t>
+      </w:r>
+      <w:hyperlink r:id="rId53">
+        <w:r>
+          <w:rPr>
+            <w:rStyle w:val="Hyperlink"/>
+          </w:rPr>
+          <w:t xml:space="preserve">https://www.nber.org/system/files/working_papers/w24029/w24029.pdf</w:t>
+        </w:r>
+      </w:hyperlink>
+      <w:r>
+        <w:t xml:space="preserve"> ; data </w:t>
+      </w:r>
+      <w:hyperlink r:id="rId54">
+        <w:r>
+          <w:rPr>
+            <w:rStyle w:val="Hyperlink"/>
+          </w:rPr>
+          <w:t xml:space="preserve">https://www.firmlevelrisk.com/</w:t>
+        </w:r>
+      </w:hyperlink>
+    </w:p>
+    <w:p>
+      <w:pPr>
+        <w:pStyle w:val="Compact"/>
+        <w:numPr>
+          <w:ilvl w:val="0"/>
+          <w:numId w:val="1001"/>
+        </w:numPr>
+      </w:pPr>
+      <w:r>
+        <w:t xml:space="preserve">Sautner et al., ECGI WP 686/2020 — </w:t>
+      </w:r>
+      <w:hyperlink r:id="rId55">
+        <w:r>
+          <w:rPr>
+            <w:rStyle w:val="Hyperlink"/>
+          </w:rPr>
+          <w:t xml:space="preserve">https://www.ecgi.global/sites/default/files/working_papers/documents/firmlevelclimatechangeexposure.pdf</w:t>
+        </w:r>
+      </w:hyperlink>
+      <w:r>
+        <w:t xml:space="preserve"> ; data </w:t>
+      </w:r>
+      <w:hyperlink r:id="rId56">
+        <w:r>
+          <w:rPr>
+            <w:rStyle w:val="Hyperlink"/>
+          </w:rPr>
+          <w:t xml:space="preserve">https://api.osf.io/v2/nodes/fd6jq/</w:t>
+        </w:r>
+      </w:hyperlink>
+    </w:p>
+    <w:p>
+      <w:pPr>
+        <w:pStyle w:val="Compact"/>
+        <w:numPr>
+          <w:ilvl w:val="0"/>
+          <w:numId w:val="1001"/>
+        </w:numPr>
+      </w:pPr>
+      <w:r>
+        <w:t xml:space="preserve">Bybee, Kelly, Manela &amp; Xiu, NBER w29344 — </w:t>
+      </w:r>
+      <w:hyperlink r:id="rId57">
+        <w:r>
+          <w:rPr>
+            <w:rStyle w:val="Hyperlink"/>
+          </w:rPr>
+          <w:t xml:space="preserve">https://www.nber.org/system/files/working_papers/w29344/w29344.pdf</w:t>
+        </w:r>
+      </w:hyperlink>
+    </w:p>
+    <w:p>
+      <w:pPr>
+        <w:pStyle w:val="Compact"/>
+        <w:numPr>
+          <w:ilvl w:val="0"/>
+          <w:numId w:val="1001"/>
+        </w:numPr>
+      </w:pPr>
+      <w:r>
+        <w:t xml:space="preserve">Kim, Muhn &amp; Nikolaev — </w:t>
+      </w:r>
+      <w:hyperlink r:id="rId58">
+        <w:r>
+          <w:rPr>
+            <w:rStyle w:val="Hyperlink"/>
+          </w:rPr>
+          <w:t xml:space="preserve">https://arxiv.org/pdf/2310.17721v2</w:t>
+        </w:r>
+      </w:hyperlink>
+      <w:r>
+        <w:t xml:space="preserve"> ; withdrawn </w:t>
+      </w:r>
+      <w:hyperlink r:id="rId59">
+        <w:r>
+          <w:rPr>
+            <w:rStyle w:val="Hyperlink"/>
+          </w:rPr>
+          <w:t xml:space="preserve">https://arxiv.org/abs/2306.10224</w:t>
+        </w:r>
+      </w:hyperlink>
+      <w:r>
+        <w:t xml:space="preserve"> , </w:t>
+      </w:r>
+      <w:hyperlink r:id="rId60">
+        <w:r>
+          <w:rPr>
+            <w:rStyle w:val="Hyperlink"/>
+          </w:rPr>
+          <w:t xml:space="preserve">https://arxiv.org/abs/2407.17866</w:t>
+        </w:r>
+      </w:hyperlink>
+    </w:p>
+    <w:p>
+      <w:pPr>
+        <w:pStyle w:val="Compact"/>
+        <w:numPr>
+          <w:ilvl w:val="0"/>
+          <w:numId w:val="1001"/>
+        </w:numPr>
+      </w:pPr>
+      <w:r>
+        <w:t xml:space="preserve">Eisfeldt, Schubert &amp; Zhang, NBER w31222 — </w:t>
+      </w:r>
+      <w:hyperlink r:id="rId61">
+        <w:r>
+          <w:rPr>
+            <w:rStyle w:val="Hyperlink"/>
+          </w:rPr>
+          <w:t xml:space="preserve">https://www.nber.org/papers/w31222</w:t>
+        </w:r>
+      </w:hyperlink>
+    </w:p>
+    <w:p>
+      <w:pPr>
+        <w:pStyle w:val="Compact"/>
+        <w:numPr>
+          <w:ilvl w:val="0"/>
+          <w:numId w:val="1001"/>
+        </w:numPr>
+      </w:pPr>
+      <w:r>
+        <w:t xml:space="preserve">THEME, arXiv 2508.16936 — </w:t>
+      </w:r>
+      <w:hyperlink r:id="rId63">
+        <w:r>
+          <w:rPr>
+            <w:rStyle w:val="Hyperlink"/>
+          </w:rPr>
+          <w:t xml:space="preserve">https://arxiv.org/html/2508.16936v2</w:t>
+        </w:r>
+      </w:hyperlink>
+    </w:p>
+    <w:p>
+      <w:pPr>
+        <w:pStyle w:val="Compact"/>
+        <w:numPr>
+          <w:ilvl w:val="0"/>
+          <w:numId w:val="1001"/>
+        </w:numPr>
+      </w:pPr>
+      <w:r>
+        <w:t xml:space="preserve">Gandouet et al., arXiv 2403.02185 — </w:t>
+      </w:r>
+      <w:hyperlink r:id="rId65">
+        <w:r>
+          <w:rPr>
+            <w:rStyle w:val="Hyperlink"/>
+          </w:rPr>
+          <w:t xml:space="preserve">https://arxiv.org/pdf/2403.02185</w:t>
+        </w:r>
+      </w:hyperlink>
+    </w:p>
+    <w:p>
+      <w:pPr>
+        <w:pStyle w:val="Compact"/>
+        <w:numPr>
+          <w:ilvl w:val="0"/>
+          <w:numId w:val="1001"/>
+        </w:numPr>
+      </w:pPr>
+      <w:r>
+        <w:t xml:space="preserve">From Text to Alpha, arXiv 2510.03195 — </w:t>
+      </w:r>
+      <w:hyperlink r:id="rId66">
+        <w:r>
+          <w:rPr>
+            <w:rStyle w:val="Hyperlink"/>
+          </w:rPr>
+          <w:t xml:space="preserve">https://arxiv.org/html/2510.03195v5</w:t>
+        </w:r>
+      </w:hyperlink>
+    </w:p>
+    <w:p>
+      <w:pPr>
+        <w:pStyle w:val="Compact"/>
+        <w:numPr>
+          <w:ilvl w:val="0"/>
+          <w:numId w:val="1001"/>
+        </w:numPr>
+      </w:pPr>
+      <w:r>
+        <w:t xml:space="preserve">Agentic Retrieval of Topics, arXiv 2507.07906 — </w:t>
+      </w:r>
+      <w:hyperlink r:id="rId67">
+        <w:r>
+          <w:rPr>
+            <w:rStyle w:val="Hyperlink"/>
+          </w:rPr>
+          <w:t xml:space="preserve">https://arxiv.org/html/2507.07906v1</w:t>
+        </w:r>
+      </w:hyperlink>
+    </w:p>
+    <w:p>
+      <w:pPr>
+        <w:pStyle w:val="Compact"/>
+        <w:numPr>
+          <w:ilvl w:val="0"/>
+          <w:numId w:val="1001"/>
+        </w:numPr>
+      </w:pPr>
+      <w:r>
+        <w:t xml:space="preserve">Candès et al., FAJ 2025 / SSRN 5336504 — </w:t>
+      </w:r>
+      <w:hyperlink r:id="rId17">
+        <w:r>
+          <w:rPr>
+            <w:rStyle w:val="Hyperlink"/>
+          </w:rPr>
+          <w:t xml:space="preserve">https://rpc.cfainstitute.org/research/financial-analysts-journal/2025/thematic-investing-risk-based-perspective</w:t>
+        </w:r>
+      </w:hyperlink>
+    </w:p>
+    <w:p>
+      <w:pPr>
+        <w:pStyle w:val="Compact"/>
+        <w:numPr>
+          <w:ilvl w:val="0"/>
+          <w:numId w:val="1001"/>
+        </w:numPr>
+      </w:pPr>
+      <w:r>
+        <w:t xml:space="preserve">Ang, Azimbayev &amp; Kim, arXiv 2604.02279 — </w:t>
+      </w:r>
+      <w:hyperlink r:id="rId83">
+        <w:r>
+          <w:rPr>
+            <w:rStyle w:val="Hyperlink"/>
+          </w:rPr>
+          <w:t xml:space="preserve">https://arxiv.org/abs/2604.02279</w:t>
+        </w:r>
+      </w:hyperlink>
     </w:p>
     <w:p>
       <w:pPr>
@@ -14843,48 +15364,322 @@
         </w:rPr>
         <w:t xml:space="preserve">Firms and index providers</w:t>
       </w:r>
-      <w:r>
-        <w:t xml:space="preserve"> </w:t>
-      </w:r>
-      <w:r>
-        <w:t xml:space="preserve">- BlackRock — https://www.blackrock.com/institutions/en-us/insights/ai-investing ; https://www.blackrock.com/us/individual/insights/thematic-investing ; PDF (returned an HTML stub) https://www.blackrock.com/us/individual/literature/whitepaper/tomorrows-themes-today.pdf</w:t>
-      </w:r>
-      <w:r>
-        <w:t xml:space="preserve"> </w:t>
-      </w:r>
-      <w:r>
-        <w:t xml:space="preserve">- MSCI — https://www.msci.com/research-and-insights/blog-post/leveraging-language-models-to-capture-investment-strategies ; https://www.msci.com/indexes/documents/methodology/2_MSCI_Thematic_Relevance_Score_Methodology_20220519.pdf ; https://www.msci.com/downloads/web/msci-com/data-and-analytics/thematic-exposure-standard-factsheet/msci-thematic-exposure-standard.pdf</w:t>
-      </w:r>
-      <w:r>
-        <w:t xml:space="preserve"> </w:t>
-      </w:r>
-      <w:r>
-        <w:t xml:space="preserve">- Robeco — https://www.robeco.com/en-ch/dynamic-theme-machine ; https://robeco.com/en-int/new-robeco-dynamic-theme-machine-etf-capture-themes-when-they-emerge ; https://www.robeco.com/en-uk/insights/2024/10/the-benefits-of-quantamental-thematic-investing ; https://www.robeco.com/en-int/products/funds/isin-ie000vg2wcw5/robeco-dynamic-theme-machine-ucits-etf-usd-acc ; https://www.robeco.com/en-int/investing-in-ai ; trade press https://risk.net/investing/7960477/robeco-fires-up-ai-thematic-etf , https://news.ultumus.com/managed-thematic-etf</w:t>
-      </w:r>
-      <w:r>
-        <w:t xml:space="preserve"> </w:t>
-      </w:r>
-      <w:r>
-        <w:t xml:space="preserve">- STOXX — https://web.stoxx.com/hubfs/Whitepapers/2019%20Whitepapers/STOXX%20Research%20-%20Indexing%20Thematic%20Megatrends.pdf ; https://stoxx.com/15-years-of-stoxx-thematic-indices-a-framework-for-capturing-themes-across-their-lifecycle/ ; https://stoxx.com/navigating-the-ai-ecosystem-a-guide-to-the-stoxx-thematic-framework/ ; https://stoxx.com/qa-with-econsight-enabling-stoxx-thematic-strategies-to-capture-evolving-technologies-such-as-ai-and-quantum/</w:t>
-      </w:r>
-      <w:r>
-        <w:t xml:space="preserve"> </w:t>
-      </w:r>
-      <w:r>
-        <w:t xml:space="preserve">- Solactive ARTIS — https://solactive.com/artis/ ; SEC 497K example https://www.sec.gov/Archives/edgar/data/1976322/000089418925000707/themesgenerativeartificial.htm</w:t>
-      </w:r>
-      <w:r>
-        <w:t xml:space="preserve"> </w:t>
-      </w:r>
-      <w:r>
-        <w:t xml:space="preserve">- Man Group — https://www.man.com/insights/what-ai-can-do-for-alpha</w:t>
-      </w:r>
-      <w:r>
-        <w:t xml:space="preserve"> </w:t>
-      </w:r>
-      <w:r>
-        <w:t xml:space="preserve">- Andrew Ang — https://www.andrewangphd.com ; https://www.altbridge.ai/ ; SSRN author page https://privpapers.ssrn.com/sol3/cf_dev/AbsByAuth.cfm?per_id=94010</w:t>
-      </w:r>
+    </w:p>
+    <w:p>
+      <w:pPr>
+        <w:pStyle w:val="Compact"/>
+        <w:numPr>
+          <w:ilvl w:val="0"/>
+          <w:numId w:val="1001"/>
+        </w:numPr>
+      </w:pPr>
+      <w:r>
+        <w:t xml:space="preserve">BlackRock — </w:t>
+      </w:r>
+      <w:hyperlink r:id="rId15">
+        <w:r>
+          <w:rPr>
+            <w:rStyle w:val="Hyperlink"/>
+          </w:rPr>
+          <w:t xml:space="preserve">https://www.blackrock.com/institutions/en-us/insights/ai-investing</w:t>
+        </w:r>
+      </w:hyperlink>
+      <w:r>
+        <w:t xml:space="preserve"> ; </w:t>
+      </w:r>
+      <w:hyperlink r:id="rId69">
+        <w:r>
+          <w:rPr>
+            <w:rStyle w:val="Hyperlink"/>
+          </w:rPr>
+          <w:t xml:space="preserve">https://www.blackrock.com/us/individual/insights/thematic-investing</w:t>
+        </w:r>
+      </w:hyperlink>
+      <w:r>
+        <w:t xml:space="preserve"> ; PDF (returned an HTML stub) </w:t>
+      </w:r>
+      <w:hyperlink r:id="rId18">
+        <w:r>
+          <w:rPr>
+            <w:rStyle w:val="Hyperlink"/>
+          </w:rPr>
+          <w:t xml:space="preserve">https://www.blackrock.com/us/individual/literature/whitepaper/tomorrows-themes-today.pdf</w:t>
+        </w:r>
+      </w:hyperlink>
+    </w:p>
+    <w:p>
+      <w:pPr>
+        <w:pStyle w:val="Compact"/>
+        <w:numPr>
+          <w:ilvl w:val="0"/>
+          <w:numId w:val="1001"/>
+        </w:numPr>
+      </w:pPr>
+      <w:r>
+        <w:t xml:space="preserve">MSCI — </w:t>
+      </w:r>
+      <w:hyperlink r:id="rId16">
+        <w:r>
+          <w:rPr>
+            <w:rStyle w:val="Hyperlink"/>
+          </w:rPr>
+          <w:t xml:space="preserve">https://www.msci.com/research-and-insights/blog-post/leveraging-language-models-to-capture-investment-strategies</w:t>
+        </w:r>
+      </w:hyperlink>
+      <w:r>
+        <w:t xml:space="preserve"> ; </w:t>
+      </w:r>
+      <w:hyperlink r:id="rId70">
+        <w:r>
+          <w:rPr>
+            <w:rStyle w:val="Hyperlink"/>
+          </w:rPr>
+          <w:t xml:space="preserve">https://www.msci.com/indexes/documents/methodology/2_MSCI_Thematic_Relevance_Score_Methodology_20220519.pdf</w:t>
+        </w:r>
+      </w:hyperlink>
+      <w:r>
+        <w:t xml:space="preserve"> ; </w:t>
+      </w:r>
+      <w:hyperlink r:id="rId20">
+        <w:r>
+          <w:rPr>
+            <w:rStyle w:val="Hyperlink"/>
+          </w:rPr>
+          <w:t xml:space="preserve">https://www.msci.com/downloads/web/msci-com/data-and-analytics/thematic-exposure-standard-factsheet/msci-thematic-exposure-standard.pdf</w:t>
+        </w:r>
+      </w:hyperlink>
+    </w:p>
+    <w:p>
+      <w:pPr>
+        <w:pStyle w:val="Compact"/>
+        <w:numPr>
+          <w:ilvl w:val="0"/>
+          <w:numId w:val="1001"/>
+        </w:numPr>
+      </w:pPr>
+      <w:r>
+        <w:t xml:space="preserve">Robeco — </w:t>
+      </w:r>
+      <w:hyperlink r:id="rId71">
+        <w:r>
+          <w:rPr>
+            <w:rStyle w:val="Hyperlink"/>
+          </w:rPr>
+          <w:t xml:space="preserve">https://www.robeco.com/en-ch/dynamic-theme-machine</w:t>
+        </w:r>
+      </w:hyperlink>
+      <w:r>
+        <w:t xml:space="preserve"> ; </w:t>
+      </w:r>
+      <w:hyperlink r:id="rId72">
+        <w:r>
+          <w:rPr>
+            <w:rStyle w:val="Hyperlink"/>
+          </w:rPr>
+          <w:t xml:space="preserve">https://robeco.com/en-int/new-robeco-dynamic-theme-machine-etf-capture-themes-when-they-emerge</w:t>
+        </w:r>
+      </w:hyperlink>
+      <w:r>
+        <w:t xml:space="preserve"> ; </w:t>
+      </w:r>
+      <w:hyperlink r:id="rId73">
+        <w:r>
+          <w:rPr>
+            <w:rStyle w:val="Hyperlink"/>
+          </w:rPr>
+          <w:t xml:space="preserve">https://www.robeco.com/en-uk/insights/2024/10/the-benefits-of-quantamental-thematic-investing</w:t>
+        </w:r>
+      </w:hyperlink>
+      <w:r>
+        <w:t xml:space="preserve"> ; </w:t>
+      </w:r>
+      <w:hyperlink r:id="rId74">
+        <w:r>
+          <w:rPr>
+            <w:rStyle w:val="Hyperlink"/>
+          </w:rPr>
+          <w:t xml:space="preserve">https://www.robeco.com/en-int/products/funds/isin-ie000vg2wcw5/robeco-dynamic-theme-machine-ucits-etf-usd-acc</w:t>
+        </w:r>
+      </w:hyperlink>
+      <w:r>
+        <w:t xml:space="preserve"> ; </w:t>
+      </w:r>
+      <w:hyperlink r:id="rId77">
+        <w:r>
+          <w:rPr>
+            <w:rStyle w:val="Hyperlink"/>
+          </w:rPr>
+          <w:t xml:space="preserve">https://www.robeco.com/en-int/investing-in-ai</w:t>
+        </w:r>
+      </w:hyperlink>
+      <w:r>
+        <w:t xml:space="preserve"> ; trade press </w:t>
+      </w:r>
+      <w:hyperlink r:id="rId75">
+        <w:r>
+          <w:rPr>
+            <w:rStyle w:val="Hyperlink"/>
+          </w:rPr>
+          <w:t xml:space="preserve">https://risk.net/investing/7960477/robeco-fires-up-ai-thematic-etf</w:t>
+        </w:r>
+      </w:hyperlink>
+      <w:r>
+        <w:t xml:space="preserve"> , </w:t>
+      </w:r>
+      <w:hyperlink r:id="rId76">
+        <w:r>
+          <w:rPr>
+            <w:rStyle w:val="Hyperlink"/>
+          </w:rPr>
+          <w:t xml:space="preserve">https://news.ultumus.com/managed-thematic-etf</w:t>
+        </w:r>
+      </w:hyperlink>
+    </w:p>
+    <w:p>
+      <w:pPr>
+        <w:pStyle w:val="Compact"/>
+        <w:numPr>
+          <w:ilvl w:val="0"/>
+          <w:numId w:val="1001"/>
+        </w:numPr>
+      </w:pPr>
+      <w:r>
+        <w:t xml:space="preserve">STOXX — </w:t>
+      </w:r>
+      <w:hyperlink r:id="rId78">
+        <w:r>
+          <w:rPr>
+            <w:rStyle w:val="Hyperlink"/>
+          </w:rPr>
+          <w:t xml:space="preserve">https://web.stoxx.com/hubfs/Whitepapers/2019%20Whitepapers/STOXX%20Research%20-%20Indexing%20Thematic%20Megatrends.pdf</w:t>
+        </w:r>
+      </w:hyperlink>
+      <w:r>
+        <w:t xml:space="preserve"> ; </w:t>
+      </w:r>
+      <w:hyperlink r:id="rId79">
+        <w:r>
+          <w:rPr>
+            <w:rStyle w:val="Hyperlink"/>
+          </w:rPr>
+          <w:t xml:space="preserve">https://stoxx.com/15-years-of-stoxx-thematic-indices-a-framework-for-capturing-themes-across-their-lifecycle/</w:t>
+        </w:r>
+      </w:hyperlink>
+      <w:r>
+        <w:t xml:space="preserve"> ; </w:t>
+      </w:r>
+      <w:hyperlink r:id="rId25">
+        <w:r>
+          <w:rPr>
+            <w:rStyle w:val="Hyperlink"/>
+          </w:rPr>
+          <w:t xml:space="preserve">https://stoxx.com/navigating-the-ai-ecosystem-a-guide-to-the-stoxx-thematic-framework/</w:t>
+        </w:r>
+      </w:hyperlink>
+      <w:r>
+        <w:t xml:space="preserve"> ; </w:t>
+      </w:r>
+      <w:hyperlink r:id="rId29">
+        <w:r>
+          <w:rPr>
+            <w:rStyle w:val="Hyperlink"/>
+          </w:rPr>
+          <w:t xml:space="preserve">https://stoxx.com/qa-with-econsight-enabling-stoxx-thematic-strategies-to-capture-evolving-technologies-such-as-ai-and-quantum/</w:t>
+        </w:r>
+      </w:hyperlink>
+    </w:p>
+    <w:p>
+      <w:pPr>
+        <w:pStyle w:val="Compact"/>
+        <w:numPr>
+          <w:ilvl w:val="0"/>
+          <w:numId w:val="1001"/>
+        </w:numPr>
+      </w:pPr>
+      <w:r>
+        <w:t xml:space="preserve">Solactive ARTIS — </w:t>
+      </w:r>
+      <w:hyperlink r:id="rId80">
+        <w:r>
+          <w:rPr>
+            <w:rStyle w:val="Hyperlink"/>
+          </w:rPr>
+          <w:t xml:space="preserve">https://solactive.com/artis/</w:t>
+        </w:r>
+      </w:hyperlink>
+      <w:r>
+        <w:t xml:space="preserve"> ; SEC 497K example </w:t>
+      </w:r>
+      <w:hyperlink r:id="rId81">
+        <w:r>
+          <w:rPr>
+            <w:rStyle w:val="Hyperlink"/>
+          </w:rPr>
+          <w:t xml:space="preserve">https://www.sec.gov/Archives/edgar/data/1976322/000089418925000707/themesgenerativeartificial.htm</w:t>
+        </w:r>
+      </w:hyperlink>
+    </w:p>
+    <w:p>
+      <w:pPr>
+        <w:pStyle w:val="Compact"/>
+        <w:numPr>
+          <w:ilvl w:val="0"/>
+          <w:numId w:val="1001"/>
+        </w:numPr>
+      </w:pPr>
+      <w:r>
+        <w:t xml:space="preserve">Man Group — </w:t>
+      </w:r>
+      <w:hyperlink r:id="rId82">
+        <w:r>
+          <w:rPr>
+            <w:rStyle w:val="Hyperlink"/>
+          </w:rPr>
+          <w:t xml:space="preserve">https://www.man.com/insights/what-ai-can-do-for-alpha</w:t>
+        </w:r>
+      </w:hyperlink>
+    </w:p>
+    <w:p>
+      <w:pPr>
+        <w:pStyle w:val="Compact"/>
+        <w:numPr>
+          <w:ilvl w:val="0"/>
+          <w:numId w:val="1001"/>
+        </w:numPr>
+      </w:pPr>
+      <w:r>
+        <w:t xml:space="preserve">Andrew Ang — </w:t>
+      </w:r>
+      <w:hyperlink r:id="rId85">
+        <w:r>
+          <w:rPr>
+            <w:rStyle w:val="Hyperlink"/>
+          </w:rPr>
+          <w:t xml:space="preserve">https://www.andrewangphd.com</w:t>
+        </w:r>
+      </w:hyperlink>
+      <w:r>
+        <w:t xml:space="preserve"> ; </w:t>
+      </w:r>
+      <w:hyperlink r:id="rId33">
+        <w:r>
+          <w:rPr>
+            <w:rStyle w:val="Hyperlink"/>
+          </w:rPr>
+          <w:t xml:space="preserve">https://www.altbridge.ai/</w:t>
+        </w:r>
+      </w:hyperlink>
+      <w:r>
+        <w:t xml:space="preserve"> ; SSRN author page </w:t>
+      </w:r>
+      <w:hyperlink r:id="rId84">
+        <w:r>
+          <w:rPr>
+            <w:rStyle w:val="Hyperlink"/>
+          </w:rPr>
+          <w:t xml:space="preserve">https://privpapers.ssrn.com/sol3/cf_dev/AbsByAuth.cfm?per_id=94010</w:t>
+        </w:r>
+      </w:hyperlink>
     </w:p>
     <w:p>
       <w:pPr>
@@ -14897,24 +15692,220 @@
         </w:rPr>
         <w:t xml:space="preserve">Alpha mining and repos</w:t>
       </w:r>
-      <w:r>
-        <w:t xml:space="preserve"> </w:t>
-      </w:r>
-      <w:r>
-        <w:t xml:space="preserve">- AlphaAgent https://arxiv.org/abs/2502.16789 ; RD-Agent(Q) https://arxiv.org/html/2505.15155 , https://github.com/microsoft/RD-Agent ; AlphaBench https://alphabench.cc/ ; Alpha-GPT https://arxiv.org/abs/2308.00016 ; Chain-of-Alpha (withdrawn) https://arxiv.org/abs/2508.06312</w:t>
-      </w:r>
-      <w:r>
-        <w:t xml:space="preserve"> </w:t>
-      </w:r>
-      <w:r>
-        <w:t xml:space="preserve">- TradingAgents https://github.com/TauricResearch/TradingAgents ; FinGPT https://github.com/AI4Finance-Foundation/FinGPT ; FinRobot https://github.com/AI4Finance-Foundation/FinRobot (paper https://arxiv.org/html/2405.14767v1) ; FinMem https://github.com/pipiku915/FinMem-LLM-StockTrading ; FinCon https://github.com/The-FinAI/FinCon ; Qlib https://github.com/microsoft/qlib</w:t>
-      </w:r>
-      <w:r>
-        <w:t xml:space="preserve"> </w:t>
-      </w:r>
-      <w:r>
-        <w:t xml:space="preserve">- FinBERT https://huggingface.co/ProsusAI/finbert ; finbert-tone https://huggingface.co/yiyanghkust/finbert-tone ; Financial PhraseBank https://huggingface.co/datasets/takala/financial_phrasebank ; FinBen/PIXIU https://github.com/The-FinAI/PIXIU</w:t>
-      </w:r>
+    </w:p>
+    <w:p>
+      <w:pPr>
+        <w:pStyle w:val="Compact"/>
+        <w:numPr>
+          <w:ilvl w:val="0"/>
+          <w:numId w:val="1001"/>
+        </w:numPr>
+      </w:pPr>
+      <w:r>
+        <w:t xml:space="preserve">AlphaAgent </w:t>
+      </w:r>
+      <w:hyperlink r:id="rId87">
+        <w:r>
+          <w:rPr>
+            <w:rStyle w:val="Hyperlink"/>
+          </w:rPr>
+          <w:t xml:space="preserve">https://arxiv.org/abs/2502.16789</w:t>
+        </w:r>
+      </w:hyperlink>
+      <w:r>
+        <w:t xml:space="preserve"> ; RD-Agent(Q) </w:t>
+      </w:r>
+      <w:hyperlink r:id="rId89">
+        <w:r>
+          <w:rPr>
+            <w:rStyle w:val="Hyperlink"/>
+          </w:rPr>
+          <w:t xml:space="preserve">https://arxiv.org/html/2505.15155</w:t>
+        </w:r>
+      </w:hyperlink>
+      <w:r>
+        <w:t xml:space="preserve"> , </w:t>
+      </w:r>
+      <w:hyperlink r:id="rId90">
+        <w:r>
+          <w:rPr>
+            <w:rStyle w:val="Hyperlink"/>
+          </w:rPr>
+          <w:t xml:space="preserve">https://github.com/microsoft/RD-Agent</w:t>
+        </w:r>
+      </w:hyperlink>
+      <w:r>
+        <w:t xml:space="preserve"> ; AlphaBench </w:t>
+      </w:r>
+      <w:hyperlink r:id="rId91">
+        <w:r>
+          <w:rPr>
+            <w:rStyle w:val="Hyperlink"/>
+          </w:rPr>
+          <w:t xml:space="preserve">https://alphabench.cc/</w:t>
+        </w:r>
+      </w:hyperlink>
+      <w:r>
+        <w:t xml:space="preserve"> ; Alpha-GPT </w:t>
+      </w:r>
+      <w:hyperlink r:id="rId93">
+        <w:r>
+          <w:rPr>
+            <w:rStyle w:val="Hyperlink"/>
+          </w:rPr>
+          <w:t xml:space="preserve">https://arxiv.org/abs/2308.00016</w:t>
+        </w:r>
+      </w:hyperlink>
+      <w:r>
+        <w:t xml:space="preserve"> ; Chain-of-Alpha (withdrawn) </w:t>
+      </w:r>
+      <w:hyperlink r:id="rId94">
+        <w:r>
+          <w:rPr>
+            <w:rStyle w:val="Hyperlink"/>
+          </w:rPr>
+          <w:t xml:space="preserve">https://arxiv.org/abs/2508.06312</w:t>
+        </w:r>
+      </w:hyperlink>
+    </w:p>
+    <w:p>
+      <w:pPr>
+        <w:pStyle w:val="Compact"/>
+        <w:numPr>
+          <w:ilvl w:val="0"/>
+          <w:numId w:val="1001"/>
+        </w:numPr>
+      </w:pPr>
+      <w:r>
+        <w:t xml:space="preserve">TradingAgents </w:t>
+      </w:r>
+      <w:hyperlink r:id="rId95">
+        <w:r>
+          <w:rPr>
+            <w:rStyle w:val="Hyperlink"/>
+          </w:rPr>
+          <w:t xml:space="preserve">https://github.com/TauricResearch/TradingAgents</w:t>
+        </w:r>
+      </w:hyperlink>
+      <w:r>
+        <w:t xml:space="preserve"> ; FinGPT </w:t>
+      </w:r>
+      <w:hyperlink r:id="rId96">
+        <w:r>
+          <w:rPr>
+            <w:rStyle w:val="Hyperlink"/>
+          </w:rPr>
+          <w:t xml:space="preserve">https://github.com/AI4Finance-Foundation/FinGPT</w:t>
+        </w:r>
+      </w:hyperlink>
+      <w:r>
+        <w:t xml:space="preserve"> ; FinRobot </w:t>
+      </w:r>
+      <w:hyperlink r:id="rId97">
+        <w:r>
+          <w:rPr>
+            <w:rStyle w:val="Hyperlink"/>
+          </w:rPr>
+          <w:t xml:space="preserve">https://github.com/AI4Finance-Foundation/FinRobot</w:t>
+        </w:r>
+      </w:hyperlink>
+      <w:r>
+        <w:t xml:space="preserve"> (paper </w:t>
+      </w:r>
+      <w:hyperlink r:id="rId43">
+        <w:r>
+          <w:rPr>
+            <w:rStyle w:val="Hyperlink"/>
+          </w:rPr>
+          <w:t xml:space="preserve">https://arxiv.org/html/2405.14767v1)</w:t>
+        </w:r>
+      </w:hyperlink>
+      <w:r>
+        <w:t xml:space="preserve"> ; FinMem </w:t>
+      </w:r>
+      <w:hyperlink r:id="rId98">
+        <w:r>
+          <w:rPr>
+            <w:rStyle w:val="Hyperlink"/>
+          </w:rPr>
+          <w:t xml:space="preserve">https://github.com/pipiku915/FinMem-LLM-StockTrading</w:t>
+        </w:r>
+      </w:hyperlink>
+      <w:r>
+        <w:t xml:space="preserve"> ; FinCon </w:t>
+      </w:r>
+      <w:hyperlink r:id="rId99">
+        <w:r>
+          <w:rPr>
+            <w:rStyle w:val="Hyperlink"/>
+          </w:rPr>
+          <w:t xml:space="preserve">https://github.com/The-FinAI/FinCon</w:t>
+        </w:r>
+      </w:hyperlink>
+      <w:r>
+        <w:t xml:space="preserve"> ; Qlib </w:t>
+      </w:r>
+      <w:hyperlink r:id="rId100">
+        <w:r>
+          <w:rPr>
+            <w:rStyle w:val="Hyperlink"/>
+          </w:rPr>
+          <w:t xml:space="preserve">https://github.com/microsoft/qlib</w:t>
+        </w:r>
+      </w:hyperlink>
+    </w:p>
+    <w:p>
+      <w:pPr>
+        <w:pStyle w:val="Compact"/>
+        <w:numPr>
+          <w:ilvl w:val="0"/>
+          <w:numId w:val="1001"/>
+        </w:numPr>
+      </w:pPr>
+      <w:r>
+        <w:t xml:space="preserve">FinBERT </w:t>
+      </w:r>
+      <w:hyperlink r:id="rId104">
+        <w:r>
+          <w:rPr>
+            <w:rStyle w:val="Hyperlink"/>
+          </w:rPr>
+          <w:t xml:space="preserve">https://huggingface.co/ProsusAI/finbert</w:t>
+        </w:r>
+      </w:hyperlink>
+      <w:r>
+        <w:t xml:space="preserve"> ; finbert-tone </w:t>
+      </w:r>
+      <w:hyperlink r:id="rId107">
+        <w:r>
+          <w:rPr>
+            <w:rStyle w:val="Hyperlink"/>
+          </w:rPr>
+          <w:t xml:space="preserve">https://huggingface.co/yiyanghkust/finbert-tone</w:t>
+        </w:r>
+      </w:hyperlink>
+      <w:r>
+        <w:t xml:space="preserve"> ; Financial PhraseBank </w:t>
+      </w:r>
+      <w:hyperlink r:id="rId105">
+        <w:r>
+          <w:rPr>
+            <w:rStyle w:val="Hyperlink"/>
+          </w:rPr>
+          <w:t xml:space="preserve">https://huggingface.co/datasets/takala/financial_phrasebank</w:t>
+        </w:r>
+      </w:hyperlink>
+      <w:r>
+        <w:t xml:space="preserve"> ; FinBen/PIXIU </w:t>
+      </w:r>
+      <w:hyperlink r:id="rId106">
+        <w:r>
+          <w:rPr>
+            <w:rStyle w:val="Hyperlink"/>
+          </w:rPr>
+          <w:t xml:space="preserve">https://github.com/The-FinAI/PIXIU</w:t>
+        </w:r>
+      </w:hyperlink>
     </w:p>
     <w:p>
       <w:pPr>
@@ -14927,60 +15918,57 @@
         </w:rPr>
         <w:t xml:space="preserve">Data-timing references</w:t>
       </w:r>
-      <w:r>
-        <w:t xml:space="preserve"> </w:t>
-      </w:r>
-      <w:r>
-        <w:t xml:space="preserve">- SEC EDGAR submissions API (fields include</w:t>
-      </w:r>
-      <w:r>
-        <w:t xml:space="preserve"> </w:t>
-      </w:r>
-      <w:r>
-        <w:rPr>
-          <w:rStyle w:val="VerbatimChar"/>
-        </w:rPr>
-        <w:t xml:space="preserve">acceptanceDateTime</w:t>
-      </w:r>
-      <w:r>
-        <w:t xml:space="preserve">) — https://data.sec.gov/submissions/CIK0000320193.json ; https://www.sec.gov/search-filings/edgar-application-programming-interfaces</w:t>
-      </w:r>
-      <w:r>
-        <w:t xml:space="preserve"> </w:t>
-      </w:r>
-      <w:r>
-        <w:t xml:space="preserve">- NewsML-G2</w:t>
-      </w:r>
-      <w:r>
-        <w:t xml:space="preserve"> </w:t>
-      </w:r>
-      <w:r>
-        <w:rPr>
-          <w:rStyle w:val="VerbatimChar"/>
-        </w:rPr>
-        <w:t xml:space="preserve">firstCreated</w:t>
-      </w:r>
-      <w:r>
-        <w:t xml:space="preserve"> </w:t>
-      </w:r>
-      <w:r>
-        <w:t xml:space="preserve">/</w:t>
-      </w:r>
-      <w:r>
-        <w:t xml:space="preserve"> </w:t>
-      </w:r>
-      <w:r>
-        <w:rPr>
-          <w:rStyle w:val="VerbatimChar"/>
-        </w:rPr>
-        <w:t xml:space="preserve">versionCreated</w:t>
-      </w:r>
-      <w:r>
-        <w:t xml:space="preserve"> </w:t>
-      </w:r>
-      <w:r>
-        <w:t xml:space="preserve">example — https://iptc.org/std/NewsML-G2/2.13/examples/LISTING11_PackageItem_Complete_TopTen.xml</w:t>
-      </w:r>
+    </w:p>
+    <w:p>
+      <w:pPr>
+        <w:pStyle w:val="Compact"/>
+        <w:numPr>
+          <w:ilvl w:val="0"/>
+          <w:numId w:val="1001"/>
+        </w:numPr>
+      </w:pPr>
+      <w:r>
+        <w:t xml:space="preserve">SEC EDGAR submissions API (fields include acceptanceDateTime) — </w:t>
+      </w:r>
+      <w:hyperlink r:id="rId112">
+        <w:r>
+          <w:rPr>
+            <w:rStyle w:val="Hyperlink"/>
+          </w:rPr>
+          <w:t xml:space="preserve">https://data.sec.gov/submissions/CIK0000320193.json</w:t>
+        </w:r>
+      </w:hyperlink>
+      <w:r>
+        <w:t xml:space="preserve"> ; </w:t>
+      </w:r>
+      <w:hyperlink r:id="rId46">
+        <w:r>
+          <w:rPr>
+            <w:rStyle w:val="Hyperlink"/>
+          </w:rPr>
+          <w:t xml:space="preserve">https://www.sec.gov/search-filings/edgar-application-programming-interfaces</w:t>
+        </w:r>
+      </w:hyperlink>
+    </w:p>
+    <w:p>
+      <w:pPr>
+        <w:pStyle w:val="Compact"/>
+        <w:numPr>
+          <w:ilvl w:val="0"/>
+          <w:numId w:val="1001"/>
+        </w:numPr>
+      </w:pPr>
+      <w:r>
+        <w:t xml:space="preserve">NewsML-G2 firstCreated / versionCreated example — </w:t>
+      </w:r>
+      <w:hyperlink r:id="rId111">
+        <w:r>
+          <w:rPr>
+            <w:rStyle w:val="Hyperlink"/>
+          </w:rPr>
+          <w:t xml:space="preserve">https://iptc.org/std/NewsML-G2/2.13/examples/LISTING11_PackageItem_Complete_TopTen.xml</w:t>
+        </w:r>
+      </w:hyperlink>
     </w:p>
     <w:bookmarkEnd w:id="128"/>
     <w:sectPr>

</xml_diff>